<commit_message>
Finalize student project structure and documentation
</commit_message>
<xml_diff>
--- a/project_report.docx
+++ b/project_report.docx
@@ -20,7 +20,7 @@
     </w:p>
     <w:p>
       <w:r>
-        <w:t>Hi, I am a B.Tech CSE student. This is my data analytics project created as part of the IBM SkillsBuild / BharatCares internship. The project focuses on Customer Churn Analysis, which means studying the data of customers who stop doing business with a company.</w:t>
+        <w:t>Hi, this is my data analytics project submitted for the IBM SkillsBuild Data Analytics with AI internship. In this project, I used Python to analyze customer churn.</w:t>
       </w:r>
     </w:p>
     <w:p>
@@ -33,15 +33,7 @@
     </w:p>
     <w:p>
       <w:r>
-        <w:t>The main goal of this project is to analyze customer data to understand:</w:t>
-        <w:br/>
-        <w:t>- How many customers are leaving.</w:t>
-        <w:br/>
-        <w:t>- Which customer groups have a higher churn rate.</w:t>
-        <w:br/>
-        <w:t>- Whether factors like contract type, internet service, and customer tenure affect churn.</w:t>
-        <w:br/>
-        <w:t>- What possible business actions the company can take to retain customers.</w:t>
+        <w:t>The business problem is that customers are leaving the service. I wanted to find out why they are leaving and what the company can do to retain them.</w:t>
       </w:r>
     </w:p>
     <w:p>
@@ -49,12 +41,22 @@
         <w:pStyle w:val="Heading1"/>
       </w:pPr>
       <w:r>
-        <w:t>3. Dataset</w:t>
+        <w:t>3. Objective</w:t>
       </w:r>
     </w:p>
     <w:p>
       <w:r>
-        <w:t>I used the IBM Telco Customer Churn sample dataset. It includes information about telecom customers, such as their tenure, monthly charges, contract type, internet service, and whether they left the company (churned).</w:t>
+        <w:t>My main objective was to answer simple business questions:</w:t>
+        <w:br/>
+        <w:t>- How many customers are there?</w:t>
+        <w:br/>
+        <w:t>- What percentage of customers have churned?</w:t>
+        <w:br/>
+        <w:t>- Which customer groups have higher churn?</w:t>
+        <w:br/>
+        <w:t>- Does contract type or internet service affect churn?</w:t>
+        <w:br/>
+        <w:t>- What possible business action can be taken?</w:t>
       </w:r>
     </w:p>
     <w:p>
@@ -62,22 +64,12 @@
         <w:pStyle w:val="Heading1"/>
       </w:pPr>
       <w:r>
-        <w:t>4. Data Cleaning</w:t>
+        <w:t>4. Dataset</w:t>
       </w:r>
     </w:p>
     <w:p>
       <w:r>
-        <w:t>Before analyzing the data, I cleaned it using Pandas in Python. I:</w:t>
-        <w:br/>
-        <w:t>- Loaded the dataset from the CSV link.</w:t>
-        <w:br/>
-        <w:t>- Converted the 'TotalCharges' column into a numeric format (it had some empty spaces).</w:t>
-        <w:br/>
-        <w:t>- Removed a few rows that had missing values in TotalCharges.</w:t>
-        <w:br/>
-        <w:t>- Created a simple 'ChurnFlag' column (1 for Yes, 0 for No) to make calculations easier.</w:t>
-        <w:br/>
-        <w:t>- Created tenure groups like '0-1 Year' to make the charts simpler to read.</w:t>
+        <w:t>I used the IBM Telco Customer Churn sample dataset. It contains customer demographics, account information (like contract type and monthly charges), and whether the customer churned.</w:t>
       </w:r>
     </w:p>
     <w:p>
@@ -85,18 +77,24 @@
         <w:pStyle w:val="Heading1"/>
       </w:pPr>
       <w:r>
-        <w:t>5. Analysis</w:t>
+        <w:t>5. Data Cleaning</w:t>
       </w:r>
     </w:p>
     <w:p>
       <w:r>
-        <w:t>I used Matplotlib to create simple charts and found some clear patterns:</w:t>
+        <w:t>I used Pandas for data cleaning:</w:t>
         <w:br/>
-        <w:t>- Churn by Contract: Customers on a 'Month-to-Month' contract have a much higher churn rate compared to those on 1-year or 2-year contracts.</w:t>
+        <w:t>- Loaded the CSV data.</w:t>
         <w:br/>
-        <w:t>- Churn by Internet Service: Customers using 'Fiber optic' internet leave more often than those using DSL or no internet.</w:t>
+        <w:t>- Checked for missing values.</w:t>
         <w:br/>
-        <w:t>- Churn by Tenure: Most churn happens in the first year (0-1 Year group).</w:t>
+        <w:t>- Converted the TotalCharges column from text to numeric format.</w:t>
+        <w:br/>
+        <w:t>- Dropped a few rows where TotalCharges was missing.</w:t>
+        <w:br/>
+        <w:t>- Created a numeric ChurnFlag column (1 or 0).</w:t>
+        <w:br/>
+        <w:t>- Created a tenure group column to make the charts easier to read.</w:t>
       </w:r>
     </w:p>
     <w:p>
@@ -104,12 +102,12 @@
         <w:pStyle w:val="Heading1"/>
       </w:pPr>
       <w:r>
-        <w:t>6. Machine Learning Model</w:t>
+        <w:t>6. Exploratory Data Analysis</w:t>
       </w:r>
     </w:p>
     <w:p>
       <w:r>
-        <w:t>I built a basic Logistic Regression model using Scikit-Learn to see if I could predict churn. I split the data into training (80%) and testing (20%) sets. I converted text columns into numbers using one-hot encoding and scaled the numerical columns so the model could learn better.</w:t>
+        <w:t>I created simple charts using Matplotlib to see the patterns in the data visually. I focused on comparing the churn rate against different columns like contract type and internet service.</w:t>
       </w:r>
     </w:p>
     <w:p>
@@ -117,12 +115,18 @@
         <w:pStyle w:val="Heading1"/>
       </w:pPr>
       <w:r>
-        <w:t>7. Results</w:t>
+        <w:t>7. KPIs</w:t>
       </w:r>
     </w:p>
     <w:p>
       <w:r>
-        <w:t>When I tested the model on the test data, it gave an ROC-AUC score of around 0.84 and an F1 score of around 0.59. This means the model is decent at recognizing risk patterns, but it is just a basic baseline and does not guarantee exactly who will leave.</w:t>
+        <w:t>Based on the clean dataset:</w:t>
+        <w:br/>
+        <w:t>- Total Customers: 7,032</w:t>
+        <w:br/>
+        <w:t>- Churn Rate: Around 26.6%</w:t>
+        <w:br/>
+        <w:t>- Average Monthly Charges: Around $64.80</w:t>
       </w:r>
     </w:p>
     <w:p>
@@ -130,28 +134,18 @@
         <w:pStyle w:val="Heading1"/>
       </w:pPr>
       <w:r>
-        <w:t>8. Risk, Opportunity, and Possible Action</w:t>
+        <w:t>8. Churn Analysis</w:t>
       </w:r>
     </w:p>
     <w:p>
       <w:r>
-        <w:t>Risk:</w:t>
+        <w:t>From the charts, I observed that:</w:t>
         <w:br/>
-        <w:t>Customers with Month-to-Month contracts and Fiber Optic internet are at high risk of leaving.</w:t>
+        <w:t>- Customers on month-to-month contracts churn the most.</w:t>
         <w:br/>
+        <w:t>- Customers with Fiber Optic internet have a higher churn rate compared to DSL users.</w:t>
         <w:br/>
-        <w:t>Opportunity:</w:t>
-        <w:br/>
-        <w:t>Customers on 1-Year or 2-Year contracts are very loyal. The company should focus on getting more people into these contracts.</w:t>
-        <w:br/>
-        <w:br/>
-        <w:t>Possible Action:</w:t>
-        <w:br/>
-        <w:t>- Better Onboarding: Give more support during the first 6-12 months.</w:t>
-        <w:br/>
-        <w:t>- Targeted Retention Offers: Offer a small discount to month-to-month customers if they switch to a 1-year contract.</w:t>
-        <w:br/>
-        <w:t>- Check the Fiber Optic service to see if there are technical issues causing people to leave.</w:t>
+        <w:t>- New customers (0-1 year) have the highest churn rate.</w:t>
       </w:r>
     </w:p>
     <w:p>
@@ -159,20 +153,12 @@
         <w:pStyle w:val="Heading1"/>
       </w:pPr>
       <w:r>
-        <w:t>9. Technologies Used</w:t>
+        <w:t>9. Customer Segmentation</w:t>
       </w:r>
     </w:p>
     <w:p>
       <w:r>
-        <w:t>- Python</w:t>
-        <w:br/>
-        <w:t>- Pandas &amp; NumPy (Data Cleaning and Handling)</w:t>
-        <w:br/>
-        <w:t>- Matplotlib (Data Visualization)</w:t>
-        <w:br/>
-        <w:t>- Scikit-Learn (Basic Machine Learning)</w:t>
-        <w:br/>
-        <w:t>- Streamlit (Dashboard UI)</w:t>
+        <w:t>I grouped the customers into simple segments based on their contract and internet choices to understand where the biggest risks are.</w:t>
       </w:r>
     </w:p>
     <w:p>
@@ -180,12 +166,138 @@
         <w:pStyle w:val="Heading1"/>
       </w:pPr>
       <w:r>
-        <w:t>10. Conclusion</w:t>
+        <w:t>10. Risk Identification</w:t>
       </w:r>
     </w:p>
     <w:p>
       <w:r>
-        <w:t>In conclusion, this project helped me learn how to take raw data, clean it, find useful patterns, and suggest basic business actions. It was a great learning experience for practical data analytics.</w:t>
+        <w:t>Observation: Month-to-Month contract customers have a churn rate of around 42%.</w:t>
+        <w:br/>
+        <w:t>Possible Risk: These customers feel no commitment and can leave at any time. The Fiber Optic customers also show high churn, which could suggest a technical or pricing problem.</w:t>
+      </w:r>
+    </w:p>
+    <w:p>
+      <w:pPr>
+        <w:pStyle w:val="Heading1"/>
+      </w:pPr>
+      <w:r>
+        <w:t>11. Opportunities</w:t>
+      </w:r>
+    </w:p>
+    <w:p>
+      <w:r>
+        <w:t>Customers on 1-Year or 2-Year contracts are very loyal, with churn rates below 10%. This is a strong opportunity area.</w:t>
+      </w:r>
+    </w:p>
+    <w:p>
+      <w:pPr>
+        <w:pStyle w:val="Heading1"/>
+      </w:pPr>
+      <w:r>
+        <w:t>12. Possible Actions</w:t>
+      </w:r>
+    </w:p>
+    <w:p>
+      <w:r>
+        <w:t>- Better Onboarding: Provide more support during a customer's first year.</w:t>
+        <w:br/>
+        <w:t>- Targeted Retention Offers: Offer a discount to month-to-month customers if they switch to a 1-year contract.</w:t>
+        <w:br/>
+        <w:t>- Check Fiber Optic Service: The company should check if their Fiber Optic service has technical issues causing people to leave.</w:t>
+      </w:r>
+    </w:p>
+    <w:p>
+      <w:pPr>
+        <w:pStyle w:val="Heading1"/>
+      </w:pPr>
+      <w:r>
+        <w:t>13. Prediction Model</w:t>
+      </w:r>
+    </w:p>
+    <w:p>
+      <w:r>
+        <w:t>I built a basic Logistic Regression model using Scikit-Learn. I used train_test_split to divide the data, converted text to numbers using get_dummies, and scaled the numeric columns. This model predicts the likelihood of churn based on customer features.</w:t>
+      </w:r>
+    </w:p>
+    <w:p>
+      <w:pPr>
+        <w:pStyle w:val="Heading1"/>
+      </w:pPr>
+      <w:r>
+        <w:t>14. Technologies Used</w:t>
+      </w:r>
+    </w:p>
+    <w:p>
+      <w:r>
+        <w:t>- Python</w:t>
+        <w:br/>
+        <w:t>- Pandas</w:t>
+        <w:br/>
+        <w:t>- NumPy</w:t>
+        <w:br/>
+        <w:t>- Matplotlib</w:t>
+        <w:br/>
+        <w:t>- Scikit-learn</w:t>
+        <w:br/>
+        <w:t>- Streamlit</w:t>
+      </w:r>
+    </w:p>
+    <w:p>
+      <w:pPr>
+        <w:pStyle w:val="Heading1"/>
+      </w:pPr>
+      <w:r>
+        <w:t>15. Results/Findings</w:t>
+      </w:r>
+    </w:p>
+    <w:p>
+      <w:r>
+        <w:t>The dataset helped me confirm that contract type and internet service strongly relate to churn. The basic Logistic Regression model achieved an ROC-AUC score of 0.84 and an F1 score of 0.59, showing it can find basic risk patterns.</w:t>
+      </w:r>
+    </w:p>
+    <w:p>
+      <w:pPr>
+        <w:pStyle w:val="Heading1"/>
+      </w:pPr>
+      <w:r>
+        <w:t>16. Limitations</w:t>
+      </w:r>
+    </w:p>
+    <w:p>
+      <w:r>
+        <w:t>This is a simple student project. The prediction model is a basic baseline and does not guarantee exactly which customer will leave. It is just a helpful tool for risk identification.</w:t>
+      </w:r>
+    </w:p>
+    <w:p>
+      <w:pPr>
+        <w:pStyle w:val="Heading1"/>
+      </w:pPr>
+      <w:r>
+        <w:t>17. Conclusion</w:t>
+      </w:r>
+    </w:p>
+    <w:p>
+      <w:r>
+        <w:t>This project successfully moved from raw data to data cleaning, analysis, and finally to business insights. It helped me learn how data can guide basic business actions.</w:t>
+      </w:r>
+    </w:p>
+    <w:p>
+      <w:pPr>
+        <w:pStyle w:val="Heading1"/>
+      </w:pPr>
+      <w:r>
+        <w:t>18. Project Files</w:t>
+      </w:r>
+    </w:p>
+    <w:p>
+      <w:r>
+        <w:t>- app.py: The main Streamlit dashboard.</w:t>
+        <w:br/>
+        <w:t>- requirements.txt: The required libraries.</w:t>
+        <w:br/>
+        <w:t>- README.md: Project overview.</w:t>
+        <w:br/>
+        <w:t>- Project_Report.md / project_report.docx: This report.</w:t>
       </w:r>
     </w:p>
     <w:sectPr>

</xml_diff>